<commit_message>
Lito Sousa: revisão crítica da Parte 2
Co-Authored-By: Claude Opus 5.5 <noreply@anthropic.com>
Claude-Session: https://claude.ai/code/session_01MJjUEEZrxQDEUifKK2vj9g
</commit_message>
<xml_diff>
--- a/roteiros/lito-sousa/LitoSousa_Parte2.docx
+++ b/roteiros/lito-sousa/LitoSousa_Parte2.docx
@@ -119,7 +119,7 @@
         <w:rPr>
           <w:color w:val="C00000"/>
         </w:rPr>
-        <w:t>Guarde esse jeito calmo de falar. Porque, poucos anos depois, os mesmos fãs que se acostumaram com aquela voz tranquila iam ver o próprio Lito, num vídeo, com dificuldade para dizer cada palavra.</w:t>
+        <w:t>Guarde esse jeito calmo de falar. Porque, poucos anos depois, os mesmos fãs que se acostumaram com aquela voz tranquila iam ver o próprio Lito, num vídeo, com a fala lenta e o corpo tomado por espasmos.</w:t>
       </w:r>
     </w:p>
     <w:p>
@@ -183,7 +183,7 @@
         <w:rPr>
           <w:color w:val="000000"/>
         </w:rPr>
-        <w:t>Os fãs da cantora encontraram nos vídeos dele uma coisa que faltava no noticiário. Uma explicação dita com respeito.</w:t>
+        <w:t>Os fãs da cantora elogiaram o jeito respeitoso com que ele tratou a tragédia.</w:t>
       </w:r>
     </w:p>
     <w:p>
@@ -199,7 +199,7 @@
         <w:rPr>
           <w:color w:val="000000"/>
         </w:rPr>
-        <w:t>O mecânico que ninguém conhecia virou a voz que o Brasil ouvia depois de cada queda.</w:t>
+        <w:t>O mecânico que poucos conheciam antes da pandemia virou a voz que o Brasil ouvia depois de cada queda.</w:t>
       </w:r>
     </w:p>
     <w:p>
@@ -303,7 +303,7 @@
         <w:rPr>
           <w:color w:val="000000"/>
         </w:rPr>
-        <w:t>Em dois mil e vinte e cinco, Lito foi parar numa UTI.</w:t>
+        <w:t>Lito foi parar numa UTI.</w:t>
       </w:r>
     </w:p>
     <w:p>
@@ -327,7 +327,7 @@
         <w:rPr>
           <w:color w:val="000000"/>
         </w:rPr>
-        <w:t>Nos primeiros meses de dois mil e vinte e seis, numa bateria de exames de rotina, os médicos encontraram duas coisas.</w:t>
+        <w:t>Por volta de abril de dois mil e vinte e seis, numa bateria de exames de rotina, os médicos encontraram duas coisas.</w:t>
       </w:r>
     </w:p>
     <w:p>
@@ -431,7 +431,7 @@
         <w:rPr>
           <w:color w:val="C00000"/>
         </w:rPr>
-        <w:t>Guarde essa frase. Estou em manutenção, não em queda. Porque, no dia seguinte, Lito foi internado às pressas. E o que os médicos começaram a encontrar no corpo dele não tinha nada a ver com o câncer.</w:t>
+        <w:t>Guarde essa frase. Estou em manutenção, não em queda. Porque, no dia seguinte, Lito foi internado. E o que os médicos começaram a encontrar no corpo dele não tinha nada a ver com o câncer.</w:t>
       </w:r>
     </w:p>
     <w:p>
@@ -511,7 +511,7 @@
         <w:rPr>
           <w:color w:val="000000"/>
         </w:rPr>
-        <w:t>Só que os médicos continuavam procurando. Porque a inflamação não explicava tudo. Havia alguma coisa por trás dela.</w:t>
+        <w:t>Só que Lito continuava internado. Os médicos ainda procuravam o que estava causando aquela inflamação.</w:t>
       </w:r>
     </w:p>
     <w:p>
@@ -519,7 +519,7 @@
         <w:rPr>
           <w:color w:val="C00000"/>
         </w:rPr>
-        <w:t>O que eles encontraram tinha um nome que quase nenhum brasileiro conhecia. Uma doença tão rara que atinge cerca de uma pessoa em cada milhão. E, no dia vinte e um de agosto, foi a esposa dele quem precisou contar ao país.</w:t>
+        <w:t>O que eles encontraram tinha um nome que quase nenhum brasileiro conhecia. Uma doença tão rara que atinge cerca de uma pessoa em cada milhão, por ano. E, no dia vinte e um de agosto, foi a esposa dele quem precisou contar ao país.</w:t>
       </w:r>
     </w:p>
     <w:sectPr>

</xml_diff>